<commit_message>
feat: implement Kafka-based email notification service and user authentication controllers with password reset functionality.
</commit_message>
<xml_diff>
--- a/readme.docx
+++ b/readme.docx
@@ -428,13 +428,7 @@
         <w:rPr>
           <w:lang w:val="en-US"/>
         </w:rPr>
-        <w:t>@types/</w:t>
-      </w:r>
-      <w:r>
-        <w:rPr>
-          <w:lang w:val="en-US"/>
-        </w:rPr>
-        <w:t xml:space="preserve">express </w:t>
+        <w:t xml:space="preserve">@types/express </w:t>
       </w:r>
       <w:r>
         <w:rPr>
@@ -1845,8 +1839,327 @@
         </w:rPr>
         <w:t xml:space="preserve"> install next-themes</w:t>
       </w:r>
+    </w:p>
+    <w:p>
+      <w:pPr>
+        <w:rPr>
+          <w:lang w:val="en-US"/>
+        </w:rPr>
+      </w:pPr>
+      <w:proofErr w:type="spellStart"/>
+      <w:r>
+        <w:rPr>
+          <w:lang w:val="en-US"/>
+        </w:rPr>
+        <w:t>npm</w:t>
+      </w:r>
+      <w:proofErr w:type="spellEnd"/>
+      <w:r>
+        <w:rPr>
+          <w:lang w:val="en-US"/>
+        </w:rPr>
+        <w:t xml:space="preserve"> install @google/</w:t>
+      </w:r>
+      <w:proofErr w:type="spellStart"/>
+      <w:r>
+        <w:rPr>
+          <w:lang w:val="en-US"/>
+        </w:rPr>
+        <w:t>genai</w:t>
+      </w:r>
+      <w:proofErr w:type="spellEnd"/>
+    </w:p>
+    <w:p>
+      <w:pPr>
+        <w:rPr>
+          <w:lang w:val="en-US"/>
+        </w:rPr>
+      </w:pPr>
+      <w:r>
+        <w:rPr>
+          <w:lang w:val="en-US"/>
+        </w:rPr>
+        <w:t>Remove-Item -Recurse -</w:t>
+      </w:r>
+      <w:proofErr w:type="gramStart"/>
+      <w:r>
+        <w:rPr>
+          <w:lang w:val="en-US"/>
+        </w:rPr>
+        <w:t>Force .next</w:t>
+      </w:r>
+      <w:proofErr w:type="gramEnd"/>
+    </w:p>
+    <w:p>
+      <w:pPr>
+        <w:rPr>
+          <w:lang w:val="en-US"/>
+        </w:rPr>
+      </w:pPr>
+      <w:proofErr w:type="spellStart"/>
+      <w:r>
+        <w:rPr>
+          <w:lang w:val="en-US"/>
+        </w:rPr>
+        <w:t>npm</w:t>
+      </w:r>
+      <w:proofErr w:type="spellEnd"/>
+      <w:r>
+        <w:rPr>
+          <w:lang w:val="en-US"/>
+        </w:rPr>
+        <w:t xml:space="preserve"> </w:t>
+      </w:r>
+      <w:proofErr w:type="spellStart"/>
+      <w:r>
+        <w:rPr>
+          <w:lang w:val="en-US"/>
+        </w:rPr>
+        <w:t>i</w:t>
+      </w:r>
+      <w:proofErr w:type="spellEnd"/>
+      <w:r>
+        <w:rPr>
+          <w:lang w:val="en-US"/>
+        </w:rPr>
+        <w:t xml:space="preserve"> </w:t>
+      </w:r>
+      <w:proofErr w:type="spellStart"/>
+      <w:r>
+        <w:rPr>
+          <w:lang w:val="en-US"/>
+        </w:rPr>
+        <w:t>nodemailer</w:t>
+      </w:r>
+      <w:proofErr w:type="spellEnd"/>
+      <w:r>
+        <w:rPr>
+          <w:lang w:val="en-US"/>
+        </w:rPr>
+        <w:t xml:space="preserve"> </w:t>
+      </w:r>
+      <w:proofErr w:type="spellStart"/>
+      <w:r>
+        <w:rPr>
+          <w:lang w:val="en-US"/>
+        </w:rPr>
+        <w:t>kafkajs</w:t>
+      </w:r>
+      <w:proofErr w:type="spellEnd"/>
+    </w:p>
+    <w:p>
+      <w:pPr>
+        <w:rPr>
+          <w:lang w:val="en-US"/>
+        </w:rPr>
+      </w:pPr>
+      <w:proofErr w:type="spellStart"/>
+      <w:r>
+        <w:rPr>
+          <w:lang w:val="en-US"/>
+        </w:rPr>
+        <w:t>npm</w:t>
+      </w:r>
+      <w:proofErr w:type="spellEnd"/>
+      <w:r>
+        <w:rPr>
+          <w:lang w:val="en-US"/>
+        </w:rPr>
+        <w:t xml:space="preserve"> </w:t>
+      </w:r>
+      <w:proofErr w:type="spellStart"/>
+      <w:r>
+        <w:rPr>
+          <w:lang w:val="en-US"/>
+        </w:rPr>
+        <w:t>i</w:t>
+      </w:r>
+      <w:proofErr w:type="spellEnd"/>
+      <w:r>
+        <w:rPr>
+          <w:lang w:val="en-US"/>
+        </w:rPr>
+        <w:t xml:space="preserve"> </w:t>
+      </w:r>
+      <w:proofErr w:type="spellStart"/>
+      <w:r>
+        <w:rPr>
+          <w:lang w:val="en-US"/>
+        </w:rPr>
+        <w:t>kafkajs</w:t>
+      </w:r>
+      <w:proofErr w:type="spellEnd"/>
+    </w:p>
+    <w:p>
+      <w:pPr>
+        <w:rPr>
+          <w:lang w:val="en-US"/>
+        </w:rPr>
+      </w:pPr>
+      <w:proofErr w:type="spellStart"/>
+      <w:r>
+        <w:rPr>
+          <w:lang w:val="en-US"/>
+        </w:rPr>
+        <w:t>npm</w:t>
+      </w:r>
+      <w:proofErr w:type="spellEnd"/>
+      <w:r>
+        <w:rPr>
+          <w:lang w:val="en-US"/>
+        </w:rPr>
+        <w:t xml:space="preserve"> </w:t>
+      </w:r>
+      <w:proofErr w:type="spellStart"/>
+      <w:r>
+        <w:rPr>
+          <w:lang w:val="en-US"/>
+        </w:rPr>
+        <w:t>i</w:t>
+      </w:r>
+      <w:proofErr w:type="spellEnd"/>
+      <w:r>
+        <w:rPr>
+          <w:lang w:val="en-US"/>
+        </w:rPr>
+        <w:t xml:space="preserve"> </w:t>
+      </w:r>
+      <w:r>
+        <w:rPr>
+          <w:lang w:val="en-US"/>
+        </w:rPr>
+        <w:t>-D @types/</w:t>
+      </w:r>
       <w:bookmarkStart w:id="0" w:name="_GoBack"/>
       <w:bookmarkEnd w:id="0"/>
+      <w:proofErr w:type="spellStart"/>
+      <w:r>
+        <w:rPr>
+          <w:lang w:val="en-US"/>
+        </w:rPr>
+        <w:t>kafkajs</w:t>
+      </w:r>
+      <w:proofErr w:type="spellEnd"/>
+    </w:p>
+    <w:p>
+      <w:pPr>
+        <w:rPr>
+          <w:lang w:val="en-US"/>
+        </w:rPr>
+      </w:pPr>
+      <w:proofErr w:type="spellStart"/>
+      <w:r>
+        <w:rPr>
+          <w:lang w:val="en-US"/>
+        </w:rPr>
+        <w:t>npm</w:t>
+      </w:r>
+      <w:proofErr w:type="spellEnd"/>
+      <w:r>
+        <w:rPr>
+          <w:lang w:val="en-US"/>
+        </w:rPr>
+        <w:t xml:space="preserve"> </w:t>
+      </w:r>
+      <w:proofErr w:type="spellStart"/>
+      <w:r>
+        <w:rPr>
+          <w:lang w:val="en-US"/>
+        </w:rPr>
+        <w:t>i</w:t>
+      </w:r>
+      <w:proofErr w:type="spellEnd"/>
+      <w:r>
+        <w:rPr>
+          <w:lang w:val="en-US"/>
+        </w:rPr>
+        <w:t xml:space="preserve"> </w:t>
+      </w:r>
+      <w:r>
+        <w:rPr>
+          <w:lang w:val="en-US"/>
+        </w:rPr>
+        <w:t>@types/</w:t>
+      </w:r>
+      <w:proofErr w:type="spellStart"/>
+      <w:r>
+        <w:rPr>
+          <w:lang w:val="en-US"/>
+        </w:rPr>
+        <w:t>kafkajs</w:t>
+      </w:r>
+      <w:proofErr w:type="spellEnd"/>
+    </w:p>
+    <w:p>
+      <w:pPr>
+        <w:rPr>
+          <w:lang w:val="en-US"/>
+        </w:rPr>
+      </w:pPr>
+      <w:proofErr w:type="spellStart"/>
+      <w:r>
+        <w:rPr>
+          <w:lang w:val="en-US"/>
+        </w:rPr>
+        <w:t>npm</w:t>
+      </w:r>
+      <w:proofErr w:type="spellEnd"/>
+      <w:r>
+        <w:rPr>
+          <w:lang w:val="en-US"/>
+        </w:rPr>
+        <w:t xml:space="preserve"> </w:t>
+      </w:r>
+      <w:proofErr w:type="spellStart"/>
+      <w:r>
+        <w:rPr>
+          <w:lang w:val="en-US"/>
+        </w:rPr>
+        <w:t>i</w:t>
+      </w:r>
+      <w:proofErr w:type="spellEnd"/>
+      <w:r>
+        <w:rPr>
+          <w:lang w:val="en-US"/>
+        </w:rPr>
+        <w:t xml:space="preserve"> @types/</w:t>
+      </w:r>
+      <w:proofErr w:type="spellStart"/>
+      <w:r>
+        <w:rPr>
+          <w:lang w:val="en-US"/>
+        </w:rPr>
+        <w:t>nodemailer</w:t>
+      </w:r>
+      <w:proofErr w:type="spellEnd"/>
+    </w:p>
+    <w:p>
+      <w:pPr>
+        <w:rPr>
+          <w:lang w:val="en-US"/>
+        </w:rPr>
+      </w:pPr>
+    </w:p>
+    <w:p>
+      <w:pPr>
+        <w:rPr>
+          <w:lang w:val="en-US"/>
+        </w:rPr>
+      </w:pPr>
+    </w:p>
+    <w:p>
+      <w:pPr>
+        <w:rPr>
+          <w:lang w:val="en-US"/>
+        </w:rPr>
+      </w:pPr>
+    </w:p>
+    <w:p>
+      <w:pPr>
+        <w:rPr>
+          <w:lang w:val="en-US"/>
+        </w:rPr>
+      </w:pPr>
     </w:p>
     <w:sectPr>
       <w:pgSz w:w="11906" w:h="16838"/>

</xml_diff>